<commit_message>
Documents ISO : ajout d'une note 'Comment utiliser ce document' en tete de chaque document (guide non technique + prochaine etape)
Co-Authored-By: Claude Opus 4.8 <noreply@anthropic.com>
</commit_message>
<xml_diff>
--- a/apps/web/public/iso/AI-06-Audit-interne.docx
+++ b/apps/web/public/iso/AI-06-Audit-interne.docx
@@ -74,6 +74,76 @@
       </w:pPr>
       <w:r>
         <w:t xml:space="preserve">Statut : procédure à valider + premier plan</w:t>
+      </w:r>
+    </w:p>
+    <w:p>
+      <w:pPr>
+        <w:pStyle w:val="Heading2"/>
+        <w:spacing w:after="60" w:before="160"/>
+      </w:pPr>
+      <w:r>
+        <w:t xml:space="preserve">Comment utiliser ce document</w:t>
+      </w:r>
+    </w:p>
+    <w:p>
+      <w:pPr>
+        <w:spacing w:after="120"/>
+      </w:pPr>
+      <w:r>
+        <w:t xml:space="preserve">C'est le contrôle interne planifié qui vérifie que tout fonctionne réellement, pas seulement sur le papier.</w:t>
+      </w:r>
+    </w:p>
+    <w:p>
+      <w:pPr>
+        <w:spacing w:after="120"/>
+      </w:pPr>
+      <w:r>
+        <w:rPr>
+          <w:b/>
+          <w:bCs/>
+        </w:rPr>
+        <w:t xml:space="preserve">À faire :</w:t>
+      </w:r>
+    </w:p>
+    <w:p>
+      <w:pPr>
+        <w:pStyle w:val="ListParagraph"/>
+        <w:numPr>
+          <w:ilvl w:val="0"/>
+          <w:numId w:val="1"/>
+        </w:numPr>
+        <w:spacing w:after="60"/>
+      </w:pPr>
+      <w:r>
+        <w:t xml:space="preserve">Faire auditer un domaine par une personne qui n'en est pas responsable.</w:t>
+      </w:r>
+    </w:p>
+    <w:p>
+      <w:pPr>
+        <w:pStyle w:val="ListParagraph"/>
+        <w:numPr>
+          <w:ilvl w:val="0"/>
+          <w:numId w:val="1"/>
+        </w:numPr>
+        <w:spacing w:after="60"/>
+      </w:pPr>
+      <w:r>
+        <w:t xml:space="preserve">Consigner les écarts trouvés et les corriger.</w:t>
+      </w:r>
+    </w:p>
+    <w:p>
+      <w:pPr>
+        <w:spacing w:after="120"/>
+      </w:pPr>
+      <w:r>
+        <w:rPr>
+          <w:b/>
+          <w:bCs/>
+        </w:rPr>
+        <w:t xml:space="preserve">Prochaine étape :</w:t>
+      </w:r>
+      <w:r>
+        <w:t xml:space="preserve"> réaliser un premier audit interne avant de contacter un certificateur. Si l'indépendance est difficile en interne, prévoir un auditeur externe.</w:t>
       </w:r>
     </w:p>
     <w:p>

</xml_diff>

<commit_message>
Documents ISO : titres nettoyes (sans tiret long), organisation en metadonnee, texte noir sobre ; tirets longs du corps remplaces par une ponctuation ordinaire
Co-Authored-By: Claude Opus 4.8 <noreply@anthropic.com>
</commit_message>
<xml_diff>
--- a/apps/web/public/iso/AI-06-Audit-interne.docx
+++ b/apps/web/public/iso/AI-06-Audit-interne.docx
@@ -8,7 +8,7 @@
         <w:spacing w:after="60" w:before="160"/>
       </w:pPr>
       <w:r>
-        <w:t xml:space="preserve">Programme d'audit interne du SMSI — Police Bagage</w:t>
+        <w:t xml:space="preserve">Programme d'audit interne du SMSI</w:t>
       </w:r>
     </w:p>
     <w:p>
@@ -21,7 +21,7 @@
         <w:spacing w:after="60"/>
       </w:pPr>
       <w:r>
-        <w:t xml:space="preserve">Référence : AI-06</w:t>
+        <w:t xml:space="preserve">Organisation : Police Bagage</w:t>
       </w:r>
     </w:p>
     <w:p>
@@ -34,7 +34,7 @@
         <w:spacing w:after="60"/>
       </w:pPr>
       <w:r>
-        <w:t xml:space="preserve">Version : 0.1 (projet)</w:t>
+        <w:t xml:space="preserve">Référence : AI-06</w:t>
       </w:r>
     </w:p>
     <w:p>
@@ -47,7 +47,7 @@
         <w:spacing w:after="60"/>
       </w:pPr>
       <w:r>
-        <w:t xml:space="preserve">Date : 2026-09-07</w:t>
+        <w:t xml:space="preserve">Version : 0.1 (projet)</w:t>
       </w:r>
     </w:p>
     <w:p>
@@ -60,7 +60,7 @@
         <w:spacing w:after="60"/>
       </w:pPr>
       <w:r>
-        <w:t xml:space="preserve">Contrôle ISO/IEC 27001:2022 : Clause 9.2</w:t>
+        <w:t xml:space="preserve">Date : 2026-09-07</w:t>
       </w:r>
     </w:p>
     <w:p>
@@ -73,36 +73,7 @@
         <w:spacing w:after="60"/>
       </w:pPr>
       <w:r>
-        <w:t xml:space="preserve">Statut : procédure à valider + premier plan</w:t>
-      </w:r>
-    </w:p>
-    <w:p>
-      <w:pPr>
-        <w:pStyle w:val="Heading2"/>
-        <w:spacing w:after="60" w:before="160"/>
-      </w:pPr>
-      <w:r>
-        <w:t xml:space="preserve">Comment utiliser ce document</w:t>
-      </w:r>
-    </w:p>
-    <w:p>
-      <w:pPr>
-        <w:spacing w:after="120"/>
-      </w:pPr>
-      <w:r>
-        <w:t xml:space="preserve">C'est le contrôle interne planifié qui vérifie que tout fonctionne réellement, pas seulement sur le papier.</w:t>
-      </w:r>
-    </w:p>
-    <w:p>
-      <w:pPr>
-        <w:spacing w:after="120"/>
-      </w:pPr>
-      <w:r>
-        <w:rPr>
-          <w:b/>
-          <w:bCs/>
-        </w:rPr>
-        <w:t xml:space="preserve">À faire :</w:t>
+        <w:t xml:space="preserve">Contrôle ISO/IEC 27001:2022 : Clause 9.2</w:t>
       </w:r>
     </w:p>
     <w:p>
@@ -115,7 +86,36 @@
         <w:spacing w:after="60"/>
       </w:pPr>
       <w:r>
-        <w:t xml:space="preserve">Faire auditer un domaine par une personne qui n'en est pas responsable.</w:t>
+        <w:t xml:space="preserve">Statut : procédure à valider + premier plan</w:t>
+      </w:r>
+    </w:p>
+    <w:p>
+      <w:pPr>
+        <w:pStyle w:val="Heading2"/>
+        <w:spacing w:after="60" w:before="160"/>
+      </w:pPr>
+      <w:r>
+        <w:t xml:space="preserve">Comment utiliser ce document</w:t>
+      </w:r>
+    </w:p>
+    <w:p>
+      <w:pPr>
+        <w:spacing w:after="120"/>
+      </w:pPr>
+      <w:r>
+        <w:t xml:space="preserve">C'est le contrôle interne planifié qui vérifie que tout fonctionne réellement, pas seulement sur le papier.</w:t>
+      </w:r>
+    </w:p>
+    <w:p>
+      <w:pPr>
+        <w:spacing w:after="120"/>
+      </w:pPr>
+      <w:r>
+        <w:rPr>
+          <w:b/>
+          <w:bCs/>
+        </w:rPr>
+        <w:t xml:space="preserve">À faire :</w:t>
       </w:r>
     </w:p>
     <w:p>
@@ -128,49 +128,7 @@
         <w:spacing w:after="60"/>
       </w:pPr>
       <w:r>
-        <w:t xml:space="preserve">Consigner les écarts trouvés et les corriger.</w:t>
-      </w:r>
-    </w:p>
-    <w:p>
-      <w:pPr>
-        <w:spacing w:after="120"/>
-      </w:pPr>
-      <w:r>
-        <w:rPr>
-          <w:b/>
-          <w:bCs/>
-        </w:rPr>
-        <w:t xml:space="preserve">Prochaine étape :</w:t>
-      </w:r>
-      <w:r>
-        <w:t xml:space="preserve"> réaliser un premier audit interne avant de contacter un certificateur. Si l'indépendance est difficile en interne, prévoir un auditeur externe.</w:t>
-      </w:r>
-    </w:p>
-    <w:p>
-      <w:pPr>
-        <w:pStyle w:val="Heading2"/>
-        <w:spacing w:after="60" w:before="160"/>
-      </w:pPr>
-      <w:r>
-        <w:t xml:space="preserve">1. Objet</w:t>
-      </w:r>
-    </w:p>
-    <w:p>
-      <w:pPr>
-        <w:spacing w:after="120"/>
-      </w:pPr>
-      <w:r>
-        <w:t xml:space="preserve">Vérifier, de façon planifiée et objective, que le SMSI est conforme à la norme et
-aux exigences internes, et qu'il est effectivement mis en œuvre et tenu à jour.</w:t>
-      </w:r>
-    </w:p>
-    <w:p>
-      <w:pPr>
-        <w:pStyle w:val="Heading2"/>
-        <w:spacing w:after="60" w:before="160"/>
-      </w:pPr>
-      <w:r>
-        <w:t xml:space="preserve">2. Principes</w:t>
+        <w:t xml:space="preserve">Faire auditer un domaine par une personne qui n'en est pas responsable.</w:t>
       </w:r>
     </w:p>
     <w:p>
@@ -183,16 +141,49 @@
         <w:spacing w:after="60"/>
       </w:pPr>
       <w:r>
+        <w:t xml:space="preserve">Consigner les écarts trouvés et les corriger.</w:t>
+      </w:r>
+    </w:p>
+    <w:p>
+      <w:pPr>
+        <w:spacing w:after="120"/>
+      </w:pPr>
+      <w:r>
         <w:rPr>
           <w:b/>
           <w:bCs/>
         </w:rPr>
-        <w:t xml:space="preserve">Indépendance.</w:t>
-      </w:r>
-      <w:r>
-        <w:t xml:space="preserve"> L'auditeur ne juge pas son propre travail. Dans une petite
-structure, l'auditeur d'un domaine est une personne différente du responsable
-de ce domaine (ou un prestataire externe).</w:t>
+        <w:t xml:space="preserve">Prochaine étape :</w:t>
+      </w:r>
+      <w:r>
+        <w:t xml:space="preserve"> réaliser un premier audit interne avant de contacter un certificateur. Si l'indépendance est difficile en interne, prévoir un auditeur externe.</w:t>
+      </w:r>
+    </w:p>
+    <w:p>
+      <w:pPr>
+        <w:pStyle w:val="Heading2"/>
+        <w:spacing w:after="60" w:before="160"/>
+      </w:pPr>
+      <w:r>
+        <w:t xml:space="preserve">1. Objet</w:t>
+      </w:r>
+    </w:p>
+    <w:p>
+      <w:pPr>
+        <w:spacing w:after="120"/>
+      </w:pPr>
+      <w:r>
+        <w:t xml:space="preserve">Vérifier, de façon planifiée et objective, que le SMSI est conforme à la norme et
+aux exigences internes, et qu'il est effectivement mis en œuvre et tenu à jour.</w:t>
+      </w:r>
+    </w:p>
+    <w:p>
+      <w:pPr>
+        <w:pStyle w:val="Heading2"/>
+        <w:spacing w:after="60" w:before="160"/>
+      </w:pPr>
+      <w:r>
+        <w:t xml:space="preserve">2. Principes</w:t>
       </w:r>
     </w:p>
     <w:p>
@@ -209,11 +200,12 @@
           <w:b/>
           <w:bCs/>
         </w:rPr>
-        <w:t xml:space="preserve">Fondé sur les preuves.</w:t>
-      </w:r>
-      <w:r>
-        <w:t xml:space="preserve"> Chaque constat s'appuie sur une preuve vérifiable
-(export de configuration, capture, journal, test rejoué).</w:t>
+        <w:t xml:space="preserve">Indépendance.</w:t>
+      </w:r>
+      <w:r>
+        <w:t xml:space="preserve"> L'auditeur ne juge pas son propre travail. Dans une petite
+structure, l'auditeur d'un domaine est une personne différente du responsable
+de ce domaine (ou un prestataire externe).</w:t>
       </w:r>
     </w:p>
     <w:p>
@@ -230,98 +222,11 @@
           <w:b/>
           <w:bCs/>
         </w:rPr>
-        <w:t xml:space="preserve">Couverture.</w:t>
-      </w:r>
-      <w:r>
-        <w:t xml:space="preserve"> Sur un cycle (12 mois), toutes les clauses (4 à 10) et les
-mesures applicables de l'annexe A (SOA-03) sont auditées au moins une fois.</w:t>
-      </w:r>
-    </w:p>
-    <w:p>
-      <w:pPr>
-        <w:pStyle w:val="Heading2"/>
-        <w:spacing w:after="60" w:before="160"/>
-      </w:pPr>
-      <w:r>
-        <w:t xml:space="preserve">3. Fréquence</w:t>
-      </w:r>
-    </w:p>
-    <w:p>
-      <w:pPr>
-        <w:spacing w:after="120"/>
-      </w:pPr>
-      <w:r>
-        <w:t xml:space="preserve">Au moins un audit interne complet par an, plus des audits ciblés après un
-changement majeur ou un incident critique.</w:t>
-      </w:r>
-    </w:p>
-    <w:p>
-      <w:pPr>
-        <w:pStyle w:val="Heading2"/>
-        <w:spacing w:after="60" w:before="160"/>
-      </w:pPr>
-      <w:r>
-        <w:t xml:space="preserve">4. Déroulement</w:t>
-      </w:r>
-    </w:p>
-    <w:p>
-      <w:pPr>
-        <w:spacing w:after="60"/>
-        <w:ind w:left="360" w:hanging="360"/>
-      </w:pPr>
-      <w:r>
-        <w:t xml:space="preserve">1. </w:t>
-      </w:r>
-      <w:r>
-        <w:rPr>
-          <w:b/>
-          <w:bCs/>
-        </w:rPr>
-        <w:t xml:space="preserve">Planification.</w:t>
-      </w:r>
-      <w:r>
-        <w:t xml:space="preserve"> Définir périmètre, critères (norme + documents internes),
-date, auditeur.</w:t>
-      </w:r>
-    </w:p>
-    <w:p>
-      <w:pPr>
-        <w:spacing w:after="60"/>
-        <w:ind w:left="360" w:hanging="360"/>
-      </w:pPr>
-      <w:r>
-        <w:t xml:space="preserve">2. </w:t>
-      </w:r>
-      <w:r>
-        <w:rPr>
-          <w:b/>
-          <w:bCs/>
-        </w:rPr>
-        <w:t xml:space="preserve">Revue documentaire.</w:t>
-      </w:r>
-      <w:r>
-        <w:t xml:space="preserve"> Vérifier l'existence et la cohérence des documents
-(PSI-01, RR-02, SOA-03, PGI-04, RD-05).</w:t>
-      </w:r>
-    </w:p>
-    <w:p>
-      <w:pPr>
-        <w:spacing w:after="60"/>
-        <w:ind w:left="360" w:hanging="360"/>
-      </w:pPr>
-      <w:r>
-        <w:t xml:space="preserve">3. </w:t>
-      </w:r>
-      <w:r>
-        <w:rPr>
-          <w:b/>
-          <w:bCs/>
-        </w:rPr>
-        <w:t xml:space="preserve">Tests sur le terrain.</w:t>
-      </w:r>
-      <w:r>
-        <w:t xml:space="preserve"> Vérifier que les mesures fonctionnent réellement.
-Exemples reproductibles et non destructifs :</w:t>
+        <w:t xml:space="preserve">Fondé sur les preuves.</w:t>
+      </w:r>
+      <w:r>
+        <w:t xml:space="preserve"> Chaque constat s'appuie sur une preuve vérifiable
+(export de configuration, capture, journal, test rejoué).</w:t>
       </w:r>
     </w:p>
     <w:p>
@@ -334,30 +239,102 @@
         <w:spacing w:after="60"/>
       </w:pPr>
       <w:r>
-        <w:t xml:space="preserve">RLS : sous un JWT d'agent, un </w:t>
-      </w:r>
-      <w:r>
-        <w:rPr>
-          <w:rFonts w:ascii="Consolas" w:cs="Consolas" w:eastAsia="Consolas" w:hAnsi="Consolas"/>
-          <w:sz w:val="18"/>
-          <w:szCs w:val="18"/>
-        </w:rPr>
-        <w:t xml:space="preserve">UPDATE baggage</w:t>
-      </w:r>
-      <w:r>
-        <w:t xml:space="preserve"> doit affecter 0 ligne (C-01) ;
-un </w:t>
-      </w:r>
-      <w:r>
-        <w:rPr>
-          <w:rFonts w:ascii="Consolas" w:cs="Consolas" w:eastAsia="Consolas" w:hAnsi="Consolas"/>
-          <w:sz w:val="18"/>
-          <w:szCs w:val="18"/>
-        </w:rPr>
-        <w:t xml:space="preserve">PATCH profiles.airline_code</w:t>
-      </w:r>
-      <w:r>
-        <w:t xml:space="preserve"> doit laisser la valeur inchangée (C-02).</w:t>
+        <w:rPr>
+          <w:b/>
+          <w:bCs/>
+        </w:rPr>
+        <w:t xml:space="preserve">Couverture.</w:t>
+      </w:r>
+      <w:r>
+        <w:t xml:space="preserve"> Sur un cycle (12 mois), toutes les clauses (4 à 10) et les
+mesures applicables de l'annexe A (SOA-03) sont auditées au moins une fois.</w:t>
+      </w:r>
+    </w:p>
+    <w:p>
+      <w:pPr>
+        <w:pStyle w:val="Heading2"/>
+        <w:spacing w:after="60" w:before="160"/>
+      </w:pPr>
+      <w:r>
+        <w:t xml:space="preserve">3. Fréquence</w:t>
+      </w:r>
+    </w:p>
+    <w:p>
+      <w:pPr>
+        <w:spacing w:after="120"/>
+      </w:pPr>
+      <w:r>
+        <w:t xml:space="preserve">Au moins un audit interne complet par an, plus des audits ciblés après un
+changement majeur ou un incident critique.</w:t>
+      </w:r>
+    </w:p>
+    <w:p>
+      <w:pPr>
+        <w:pStyle w:val="Heading2"/>
+        <w:spacing w:after="60" w:before="160"/>
+      </w:pPr>
+      <w:r>
+        <w:t xml:space="preserve">4. Déroulement</w:t>
+      </w:r>
+    </w:p>
+    <w:p>
+      <w:pPr>
+        <w:spacing w:after="60"/>
+        <w:ind w:left="360" w:hanging="360"/>
+      </w:pPr>
+      <w:r>
+        <w:t xml:space="preserve">1. </w:t>
+      </w:r>
+      <w:r>
+        <w:rPr>
+          <w:b/>
+          <w:bCs/>
+        </w:rPr>
+        <w:t xml:space="preserve">Planification.</w:t>
+      </w:r>
+      <w:r>
+        <w:t xml:space="preserve"> Définir périmètre, critères (norme + documents internes),
+date, auditeur.</w:t>
+      </w:r>
+    </w:p>
+    <w:p>
+      <w:pPr>
+        <w:spacing w:after="60"/>
+        <w:ind w:left="360" w:hanging="360"/>
+      </w:pPr>
+      <w:r>
+        <w:t xml:space="preserve">2. </w:t>
+      </w:r>
+      <w:r>
+        <w:rPr>
+          <w:b/>
+          <w:bCs/>
+        </w:rPr>
+        <w:t xml:space="preserve">Revue documentaire.</w:t>
+      </w:r>
+      <w:r>
+        <w:t xml:space="preserve"> Vérifier l'existence et la cohérence des documents
+(PSI-01, RR-02, SOA-03, PGI-04, RD-05).</w:t>
+      </w:r>
+    </w:p>
+    <w:p>
+      <w:pPr>
+        <w:spacing w:after="60"/>
+        <w:ind w:left="360" w:hanging="360"/>
+      </w:pPr>
+      <w:r>
+        <w:t xml:space="preserve">3. </w:t>
+      </w:r>
+      <w:r>
+        <w:rPr>
+          <w:b/>
+          <w:bCs/>
+        </w:rPr>
+        <w:t xml:space="preserve">Tests sur le terrain.</w:t>
+      </w:r>
+      <w:r>
+        <w:t xml:space="preserve"> Vérifier que les mesures fonctionnent réellement.
+Exemples reproductibles et non destructifs :</w:t>
       </w:r>
     </w:p>
     <w:p>
@@ -370,7 +347,30 @@
         <w:spacing w:after="60"/>
       </w:pPr>
       <w:r>
-        <w:t xml:space="preserve">API : un vol d'une autre compagnie doit renvoyer 403 (E-03).</w:t>
+        <w:t xml:space="preserve">RLS : sous un JWT d'agent, un </w:t>
+      </w:r>
+      <w:r>
+        <w:rPr>
+          <w:rFonts w:ascii="Consolas" w:cs="Consolas" w:eastAsia="Consolas" w:hAnsi="Consolas"/>
+          <w:sz w:val="18"/>
+          <w:szCs w:val="18"/>
+        </w:rPr>
+        <w:t xml:space="preserve">UPDATE baggage</w:t>
+      </w:r>
+      <w:r>
+        <w:t xml:space="preserve"> doit affecter 0 ligne (C-01) ;
+un </w:t>
+      </w:r>
+      <w:r>
+        <w:rPr>
+          <w:rFonts w:ascii="Consolas" w:cs="Consolas" w:eastAsia="Consolas" w:hAnsi="Consolas"/>
+          <w:sz w:val="18"/>
+          <w:szCs w:val="18"/>
+        </w:rPr>
+        <w:t xml:space="preserve">PATCH profiles.airline_code</w:t>
+      </w:r>
+      <w:r>
+        <w:t xml:space="preserve"> doit laisser la valeur inchangée (C-02).</w:t>
       </w:r>
     </w:p>
     <w:p>
@@ -383,7 +383,7 @@
         <w:spacing w:after="60"/>
       </w:pPr>
       <w:r>
-        <w:t xml:space="preserve">MFA : vérifier l'enrôlement des comptes admin/superviseur (E-06).</w:t>
+        <w:t xml:space="preserve">API : un vol d'une autre compagnie doit renvoyer 403 (E-03).</w:t>
       </w:r>
     </w:p>
     <w:p>
@@ -396,7 +396,7 @@
         <w:spacing w:after="60"/>
       </w:pPr>
       <w:r>
-        <w:t xml:space="preserve">Sauvegarde : preuve d'un test de restauration daté (R-14).</w:t>
+        <w:t xml:space="preserve">MFA : vérifier l'enrôlement des comptes admin/superviseur (E-06).</w:t>
       </w:r>
     </w:p>
     <w:p>
@@ -409,6 +409,19 @@
         <w:spacing w:after="60"/>
       </w:pPr>
       <w:r>
+        <w:t xml:space="preserve">Sauvegarde : preuve d'un test de restauration daté (R-14).</w:t>
+      </w:r>
+    </w:p>
+    <w:p>
+      <w:pPr>
+        <w:pStyle w:val="ListParagraph"/>
+        <w:numPr>
+          <w:ilvl w:val="0"/>
+          <w:numId w:val="1"/>
+        </w:numPr>
+        <w:spacing w:after="60"/>
+      </w:pPr>
+      <w:r>
         <w:t xml:space="preserve">CI : preuve d'exécution des jobs typecheck/tests/audit/secrets.</w:t>
       </w:r>
     </w:p>
@@ -612,12 +625,12 @@
       <w:tblPr>
         <w:tblW w:type="dxa" w:w="9360"/>
         <w:tblBorders>
-          <w:top w:val="single" w:color="C9D2DD" w:sz="4"/>
-          <w:left w:val="single" w:color="C9D2DD" w:sz="4"/>
-          <w:bottom w:val="single" w:color="C9D2DD" w:sz="4"/>
-          <w:right w:val="single" w:color="C9D2DD" w:sz="4"/>
-          <w:insideH w:val="single" w:color="C9D2DD" w:sz="4"/>
-          <w:insideV w:val="single" w:color="C9D2DD" w:sz="4"/>
+          <w:top w:val="single" w:color="BFBFBF" w:sz="4"/>
+          <w:left w:val="single" w:color="BFBFBF" w:sz="4"/>
+          <w:bottom w:val="single" w:color="BFBFBF" w:sz="4"/>
+          <w:right w:val="single" w:color="BFBFBF" w:sz="4"/>
+          <w:insideH w:val="single" w:color="BFBFBF" w:sz="4"/>
+          <w:insideV w:val="single" w:color="BFBFBF" w:sz="4"/>
         </w:tblBorders>
       </w:tblPr>
       <w:tblGrid>
@@ -633,7 +646,7 @@
         <w:tc>
           <w:tcPr>
             <w:tcW w:type="dxa" w:w="2340"/>
-            <w:shd w:fill="EEF2F7" w:color="auto" w:val="clear"/>
+            <w:shd w:fill="F2F2F2" w:color="auto" w:val="clear"/>
             <w:tcMar>
               <w:top w:type="dxa" w:w="40"/>
               <w:left w:type="dxa" w:w="90"/>
@@ -650,7 +663,7 @@
         <w:tc>
           <w:tcPr>
             <w:tcW w:type="dxa" w:w="2340"/>
-            <w:shd w:fill="EEF2F7" w:color="auto" w:val="clear"/>
+            <w:shd w:fill="F2F2F2" w:color="auto" w:val="clear"/>
             <w:tcMar>
               <w:top w:type="dxa" w:w="40"/>
               <w:left w:type="dxa" w:w="90"/>
@@ -667,7 +680,7 @@
         <w:tc>
           <w:tcPr>
             <w:tcW w:type="dxa" w:w="2340"/>
-            <w:shd w:fill="EEF2F7" w:color="auto" w:val="clear"/>
+            <w:shd w:fill="F2F2F2" w:color="auto" w:val="clear"/>
             <w:tcMar>
               <w:top w:type="dxa" w:w="40"/>
               <w:left w:type="dxa" w:w="90"/>
@@ -684,7 +697,7 @@
         <w:tc>
           <w:tcPr>
             <w:tcW w:type="dxa" w:w="2340"/>
-            <w:shd w:fill="EEF2F7" w:color="auto" w:val="clear"/>
+            <w:shd w:fill="F2F2F2" w:color="auto" w:val="clear"/>
             <w:tcMar>
               <w:top w:type="dxa" w:w="40"/>
               <w:left w:type="dxa" w:w="90"/>
@@ -1563,7 +1576,7 @@
     <w:rPr>
       <w:b/>
       <w:bCs/>
-      <w:color w:val="1F3A5F"/>
+      <w:color w:val="000000"/>
       <w:sz w:val="34"/>
       <w:szCs w:val="34"/>
     </w:rPr>
@@ -1576,7 +1589,7 @@
     <w:rPr>
       <w:b/>
       <w:bCs/>
-      <w:color w:val="1F3A5F"/>
+      <w:color w:val="000000"/>
       <w:sz w:val="27"/>
       <w:szCs w:val="27"/>
     </w:rPr>
@@ -1589,7 +1602,7 @@
     <w:rPr>
       <w:b/>
       <w:bCs/>
-      <w:color w:val="1F3A5F"/>
+      <w:color w:val="000000"/>
       <w:sz w:val="23"/>
       <w:szCs w:val="23"/>
     </w:rPr>
@@ -1602,7 +1615,7 @@
     <w:rPr>
       <w:b/>
       <w:bCs/>
-      <w:color w:val="1F3A5F"/>
+      <w:color w:val="000000"/>
       <w:sz w:val="23"/>
       <w:szCs w:val="23"/>
     </w:rPr>
@@ -1615,7 +1628,7 @@
     <w:rPr>
       <w:b/>
       <w:bCs/>
-      <w:color w:val="1F3A5F"/>
+      <w:color w:val="000000"/>
       <w:sz w:val="23"/>
       <w:szCs w:val="23"/>
     </w:rPr>
@@ -1628,7 +1641,7 @@
     <w:rPr>
       <w:b/>
       <w:bCs/>
-      <w:color w:val="1F3A5F"/>
+      <w:color w:val="000000"/>
       <w:sz w:val="23"/>
       <w:szCs w:val="23"/>
     </w:rPr>

</xml_diff>

<commit_message>
Documents ISO : RR-02 (registre des risques) en paysage + largeurs de colonnes proportionnelles au contenu sur tous les tableaux (registre 12 colonnes enfin lisible)
Co-Authored-By: Claude Opus 4.8 <noreply@anthropic.com>
</commit_message>
<xml_diff>
--- a/apps/web/public/iso/AI-06-Audit-interne.docx
+++ b/apps/web/public/iso/AI-06-Audit-interne.docx
@@ -623,7 +623,7 @@
     </w:p>
     <w:tbl>
       <w:tblPr>
-        <w:tblW w:type="dxa" w:w="9360"/>
+        <w:tblW w:type="dxa" w:w="9972"/>
         <w:tblBorders>
           <w:top w:val="single" w:color="BFBFBF" w:sz="4"/>
           <w:left w:val="single" w:color="BFBFBF" w:sz="4"/>
@@ -634,10 +634,10 @@
         </w:tblBorders>
       </w:tblPr>
       <w:tblGrid>
-        <w:gridCol w:w="2340"/>
-        <w:gridCol w:w="2340"/>
-        <w:gridCol w:w="2340"/>
-        <w:gridCol w:w="2340"/>
+        <w:gridCol w:w="680"/>
+        <w:gridCol w:w="3211"/>
+        <w:gridCol w:w="4347"/>
+        <w:gridCol w:w="1734"/>
       </w:tblGrid>
       <w:tr>
         <w:trPr>
@@ -645,7 +645,7 @@
         </w:trPr>
         <w:tc>
           <w:tcPr>
-            <w:tcW w:type="dxa" w:w="2340"/>
+            <w:tcW w:type="dxa" w:w="680"/>
             <w:shd w:fill="F2F2F2" w:color="auto" w:val="clear"/>
             <w:tcMar>
               <w:top w:type="dxa" w:w="40"/>
@@ -662,7 +662,7 @@
         </w:tc>
         <w:tc>
           <w:tcPr>
-            <w:tcW w:type="dxa" w:w="2340"/>
+            <w:tcW w:type="dxa" w:w="3211"/>
             <w:shd w:fill="F2F2F2" w:color="auto" w:val="clear"/>
             <w:tcMar>
               <w:top w:type="dxa" w:w="40"/>
@@ -679,7 +679,7 @@
         </w:tc>
         <w:tc>
           <w:tcPr>
-            <w:tcW w:type="dxa" w:w="2340"/>
+            <w:tcW w:type="dxa" w:w="4347"/>
             <w:shd w:fill="F2F2F2" w:color="auto" w:val="clear"/>
             <w:tcMar>
               <w:top w:type="dxa" w:w="40"/>
@@ -696,7 +696,7 @@
         </w:tc>
         <w:tc>
           <w:tcPr>
-            <w:tcW w:type="dxa" w:w="2340"/>
+            <w:tcW w:type="dxa" w:w="1734"/>
             <w:shd w:fill="F2F2F2" w:color="auto" w:val="clear"/>
             <w:tcMar>
               <w:top w:type="dxa" w:w="40"/>
@@ -715,7 +715,7 @@
       <w:tr>
         <w:tc>
           <w:tcPr>
-            <w:tcW w:type="dxa" w:w="2340"/>
+            <w:tcW w:type="dxa" w:w="680"/>
             <w:tcMar>
               <w:top w:type="dxa" w:w="40"/>
               <w:left w:type="dxa" w:w="90"/>
@@ -731,7 +731,7 @@
         </w:tc>
         <w:tc>
           <w:tcPr>
-            <w:tcW w:type="dxa" w:w="2340"/>
+            <w:tcW w:type="dxa" w:w="3211"/>
             <w:tcMar>
               <w:top w:type="dxa" w:w="40"/>
               <w:left w:type="dxa" w:w="90"/>
@@ -747,7 +747,7 @@
         </w:tc>
         <w:tc>
           <w:tcPr>
-            <w:tcW w:type="dxa" w:w="2340"/>
+            <w:tcW w:type="dxa" w:w="4347"/>
             <w:tcMar>
               <w:top w:type="dxa" w:w="40"/>
               <w:left w:type="dxa" w:w="90"/>
@@ -763,7 +763,7 @@
         </w:tc>
         <w:tc>
           <w:tcPr>
-            <w:tcW w:type="dxa" w:w="2340"/>
+            <w:tcW w:type="dxa" w:w="1734"/>
             <w:tcMar>
               <w:top w:type="dxa" w:w="40"/>
               <w:left w:type="dxa" w:w="90"/>
@@ -781,7 +781,7 @@
       <w:tr>
         <w:tc>
           <w:tcPr>
-            <w:tcW w:type="dxa" w:w="2340"/>
+            <w:tcW w:type="dxa" w:w="680"/>
             <w:tcMar>
               <w:top w:type="dxa" w:w="40"/>
               <w:left w:type="dxa" w:w="90"/>
@@ -797,7 +797,7 @@
         </w:tc>
         <w:tc>
           <w:tcPr>
-            <w:tcW w:type="dxa" w:w="2340"/>
+            <w:tcW w:type="dxa" w:w="3211"/>
             <w:tcMar>
               <w:top w:type="dxa" w:w="40"/>
               <w:left w:type="dxa" w:w="90"/>
@@ -813,7 +813,7 @@
         </w:tc>
         <w:tc>
           <w:tcPr>
-            <w:tcW w:type="dxa" w:w="2340"/>
+            <w:tcW w:type="dxa" w:w="4347"/>
             <w:tcMar>
               <w:top w:type="dxa" w:w="40"/>
               <w:left w:type="dxa" w:w="90"/>
@@ -829,7 +829,7 @@
         </w:tc>
         <w:tc>
           <w:tcPr>
-            <w:tcW w:type="dxa" w:w="2340"/>
+            <w:tcW w:type="dxa" w:w="1734"/>
             <w:tcMar>
               <w:top w:type="dxa" w:w="40"/>
               <w:left w:type="dxa" w:w="90"/>
@@ -847,7 +847,7 @@
       <w:tr>
         <w:tc>
           <w:tcPr>
-            <w:tcW w:type="dxa" w:w="2340"/>
+            <w:tcW w:type="dxa" w:w="680"/>
             <w:tcMar>
               <w:top w:type="dxa" w:w="40"/>
               <w:left w:type="dxa" w:w="90"/>
@@ -863,7 +863,7 @@
         </w:tc>
         <w:tc>
           <w:tcPr>
-            <w:tcW w:type="dxa" w:w="2340"/>
+            <w:tcW w:type="dxa" w:w="3211"/>
             <w:tcMar>
               <w:top w:type="dxa" w:w="40"/>
               <w:left w:type="dxa" w:w="90"/>
@@ -879,7 +879,7 @@
         </w:tc>
         <w:tc>
           <w:tcPr>
-            <w:tcW w:type="dxa" w:w="2340"/>
+            <w:tcW w:type="dxa" w:w="4347"/>
             <w:tcMar>
               <w:top w:type="dxa" w:w="40"/>
               <w:left w:type="dxa" w:w="90"/>
@@ -895,7 +895,7 @@
         </w:tc>
         <w:tc>
           <w:tcPr>
-            <w:tcW w:type="dxa" w:w="2340"/>
+            <w:tcW w:type="dxa" w:w="1734"/>
             <w:tcMar>
               <w:top w:type="dxa" w:w="40"/>
               <w:left w:type="dxa" w:w="90"/>
@@ -913,7 +913,7 @@
       <w:tr>
         <w:tc>
           <w:tcPr>
-            <w:tcW w:type="dxa" w:w="2340"/>
+            <w:tcW w:type="dxa" w:w="680"/>
             <w:tcMar>
               <w:top w:type="dxa" w:w="40"/>
               <w:left w:type="dxa" w:w="90"/>
@@ -929,7 +929,7 @@
         </w:tc>
         <w:tc>
           <w:tcPr>
-            <w:tcW w:type="dxa" w:w="2340"/>
+            <w:tcW w:type="dxa" w:w="3211"/>
             <w:tcMar>
               <w:top w:type="dxa" w:w="40"/>
               <w:left w:type="dxa" w:w="90"/>
@@ -945,7 +945,7 @@
         </w:tc>
         <w:tc>
           <w:tcPr>
-            <w:tcW w:type="dxa" w:w="2340"/>
+            <w:tcW w:type="dxa" w:w="4347"/>
             <w:tcMar>
               <w:top w:type="dxa" w:w="40"/>
               <w:left w:type="dxa" w:w="90"/>
@@ -961,7 +961,7 @@
         </w:tc>
         <w:tc>
           <w:tcPr>
-            <w:tcW w:type="dxa" w:w="2340"/>
+            <w:tcW w:type="dxa" w:w="1734"/>
             <w:tcMar>
               <w:top w:type="dxa" w:w="40"/>
               <w:left w:type="dxa" w:w="90"/>
@@ -979,7 +979,7 @@
       <w:tr>
         <w:tc>
           <w:tcPr>
-            <w:tcW w:type="dxa" w:w="2340"/>
+            <w:tcW w:type="dxa" w:w="680"/>
             <w:tcMar>
               <w:top w:type="dxa" w:w="40"/>
               <w:left w:type="dxa" w:w="90"/>
@@ -995,7 +995,7 @@
         </w:tc>
         <w:tc>
           <w:tcPr>
-            <w:tcW w:type="dxa" w:w="2340"/>
+            <w:tcW w:type="dxa" w:w="3211"/>
             <w:tcMar>
               <w:top w:type="dxa" w:w="40"/>
               <w:left w:type="dxa" w:w="90"/>
@@ -1011,7 +1011,7 @@
         </w:tc>
         <w:tc>
           <w:tcPr>
-            <w:tcW w:type="dxa" w:w="2340"/>
+            <w:tcW w:type="dxa" w:w="4347"/>
             <w:tcMar>
               <w:top w:type="dxa" w:w="40"/>
               <w:left w:type="dxa" w:w="90"/>
@@ -1027,7 +1027,7 @@
         </w:tc>
         <w:tc>
           <w:tcPr>
-            <w:tcW w:type="dxa" w:w="2340"/>
+            <w:tcW w:type="dxa" w:w="1734"/>
             <w:tcMar>
               <w:top w:type="dxa" w:w="40"/>
               <w:left w:type="dxa" w:w="90"/>
@@ -1045,7 +1045,7 @@
       <w:tr>
         <w:tc>
           <w:tcPr>
-            <w:tcW w:type="dxa" w:w="2340"/>
+            <w:tcW w:type="dxa" w:w="680"/>
             <w:tcMar>
               <w:top w:type="dxa" w:w="40"/>
               <w:left w:type="dxa" w:w="90"/>
@@ -1061,7 +1061,7 @@
         </w:tc>
         <w:tc>
           <w:tcPr>
-            <w:tcW w:type="dxa" w:w="2340"/>
+            <w:tcW w:type="dxa" w:w="3211"/>
             <w:tcMar>
               <w:top w:type="dxa" w:w="40"/>
               <w:left w:type="dxa" w:w="90"/>
@@ -1077,7 +1077,7 @@
         </w:tc>
         <w:tc>
           <w:tcPr>
-            <w:tcW w:type="dxa" w:w="2340"/>
+            <w:tcW w:type="dxa" w:w="4347"/>
             <w:tcMar>
               <w:top w:type="dxa" w:w="40"/>
               <w:left w:type="dxa" w:w="90"/>
@@ -1093,7 +1093,7 @@
         </w:tc>
         <w:tc>
           <w:tcPr>
-            <w:tcW w:type="dxa" w:w="2340"/>
+            <w:tcW w:type="dxa" w:w="1734"/>
             <w:tcMar>
               <w:top w:type="dxa" w:w="40"/>
               <w:left w:type="dxa" w:w="90"/>
@@ -1111,7 +1111,7 @@
       <w:tr>
         <w:tc>
           <w:tcPr>
-            <w:tcW w:type="dxa" w:w="2340"/>
+            <w:tcW w:type="dxa" w:w="680"/>
             <w:tcMar>
               <w:top w:type="dxa" w:w="40"/>
               <w:left w:type="dxa" w:w="90"/>
@@ -1127,7 +1127,7 @@
         </w:tc>
         <w:tc>
           <w:tcPr>
-            <w:tcW w:type="dxa" w:w="2340"/>
+            <w:tcW w:type="dxa" w:w="3211"/>
             <w:tcMar>
               <w:top w:type="dxa" w:w="40"/>
               <w:left w:type="dxa" w:w="90"/>
@@ -1143,7 +1143,7 @@
         </w:tc>
         <w:tc>
           <w:tcPr>
-            <w:tcW w:type="dxa" w:w="2340"/>
+            <w:tcW w:type="dxa" w:w="4347"/>
             <w:tcMar>
               <w:top w:type="dxa" w:w="40"/>
               <w:left w:type="dxa" w:w="90"/>
@@ -1159,7 +1159,7 @@
         </w:tc>
         <w:tc>
           <w:tcPr>
-            <w:tcW w:type="dxa" w:w="2340"/>
+            <w:tcW w:type="dxa" w:w="1734"/>
             <w:tcMar>
               <w:top w:type="dxa" w:w="40"/>
               <w:left w:type="dxa" w:w="90"/>

</xml_diff>

<commit_message>
ISO 27001 : etape 2 (perimetre option A retenue par la direction). Nouveau document PC-00 (perimetre, contexte, parties interessees) ; 7 documents remontes au niveau ATS (organisation, perimetre, direction = Michel TSHEFU) ; page web et 8 Word regeneres
Co-Authored-By: Claude Opus 4.8 <noreply@anthropic.com>
</commit_message>
<xml_diff>
--- a/apps/web/public/iso/AI-06-Audit-interne.docx
+++ b/apps/web/public/iso/AI-06-Audit-interne.docx
@@ -21,7 +21,20 @@
         <w:spacing w:after="60"/>
       </w:pPr>
       <w:r>
-        <w:t xml:space="preserve">Organisation : Police Bagage</w:t>
+        <w:t xml:space="preserve">Organisation : African Transport Systems (ATS Handling)</w:t>
+      </w:r>
+    </w:p>
+    <w:p>
+      <w:pPr>
+        <w:pStyle w:val="ListParagraph"/>
+        <w:numPr>
+          <w:ilvl w:val="0"/>
+          <w:numId w:val="1"/>
+        </w:numPr>
+        <w:spacing w:after="60"/>
+      </w:pPr>
+      <w:r>
+        <w:t xml:space="preserve">Périmètre : systèmes d'information numériques d'ATS, dont Police Bagage (voir PC-00)</w:t>
       </w:r>
     </w:p>
     <w:p>

</xml_diff>

<commit_message>
Documents ISO : en-tete legal (RCCM, Id. Nat., N Impot) ; le perimetre est presente comme resultat, sans reference aux options internes ; DR-07 cibles de restauration reformulees
Co-Authored-By: Claude Fable 5.1 <noreply@anthropic.com>
</commit_message>
<xml_diff>
--- a/apps/web/public/iso/AI-06-Audit-interne.docx
+++ b/apps/web/public/iso/AI-06-Audit-interne.docx
@@ -68,7 +68,7 @@
     </w:p>
     <w:p>
       <w:pPr>
-        <w:spacing w:after="60"/>
+        <w:spacing w:after="0"/>
         <w:jc w:val="center"/>
       </w:pPr>
       <w:r>
@@ -80,6 +80,22 @@
           <w:szCs w:val="18"/>
         </w:rPr>
         <w:t xml:space="preserve">Tél. : +243 819 929 881   /   E-mail : contact@ats-handling-rdc.com   /   www.ats-handling-rdc.com</w:t>
+      </w:r>
+    </w:p>
+    <w:p>
+      <w:pPr>
+        <w:spacing w:after="60"/>
+        <w:jc w:val="center"/>
+      </w:pPr>
+      <w:r>
+        <w:rPr>
+          <w:b w:val="false"/>
+          <w:bCs w:val="false"/>
+          <w:color w:val="404040"/>
+          <w:sz w:val="18"/>
+          <w:szCs w:val="18"/>
+        </w:rPr>
+        <w:t xml:space="preserve">RCCM : N° CD/KIN/RCCM/14-B-6513   /   Id. Nat. : 01-H4901-N39529 E   /   N° Impôt : A0801049A</w:t>
       </w:r>
     </w:p>
     <w:p>

</xml_diff>

<commit_message>
ISO 27001 : perimetre reecrit autour du Centre des Solutions Informatiques (CSI) : services aux 7 compagnies partenaires sur 6 escales, connectivite Starlink, produits numeriques dont Police Bagage, informatique interne. PC-00 refait ; PSI-01 (objet, perimetre, objectifs, roles : Aristarque Kasonga responsable, Martin Bitha admin/dev) ; RR-02 (+3 actifs, R-21 a R-26) ; SOA-03 (15 mesures revues, reseau et physique applicables) ; PGI-04, DR-07, RD-05, AI-06 ; signatures Responsable Informatique / DG, redacteur ; note au DG emise par le CSI ; page web
Co-Authored-By: Claude Fable 5.1 <noreply@anthropic.com>
</commit_message>
<xml_diff>
--- a/apps/web/public/iso/AI-06-Audit-interne.docx
+++ b/apps/web/public/iso/AI-06-Audit-interne.docx
@@ -144,7 +144,7 @@
               <w:jc w:val="left"/>
             </w:pPr>
             <w:r>
-              <w:t xml:space="preserve">N/Réf. : ATS/SSI/AI-06/2026</w:t>
+              <w:t xml:space="preserve">N/Réf. : ATS/CSI/AI-06/2026</w:t>
             </w:r>
           </w:p>
         </w:tc>
@@ -202,6 +202,63 @@
                 <w:szCs w:val="20"/>
               </w:rPr>
               <w:t xml:space="preserve">Version 0.1 (projet)</w:t>
+            </w:r>
+          </w:p>
+        </w:tc>
+        <w:tc>
+          <w:tcPr>
+            <w:tcW w:type="dxa" w:w="4082"/>
+            <w:tcBorders>
+              <w:top w:val="none" w:color="auto" w:sz="0"/>
+              <w:left w:val="none" w:color="auto" w:sz="0"/>
+              <w:bottom w:val="none" w:color="auto" w:sz="0"/>
+              <w:right w:val="none" w:color="auto" w:sz="0"/>
+            </w:tcBorders>
+            <w:tcMar>
+              <w:top w:type="dxa" w:w="20"/>
+              <w:left w:type="dxa" w:w="0"/>
+              <w:bottom w:type="dxa" w:w="20"/>
+              <w:right w:type="dxa" w:w="0"/>
+            </w:tcMar>
+          </w:tcPr>
+          <w:p>
+            <w:pPr>
+              <w:jc w:val="right"/>
+            </w:pPr>
+            <w:r>
+              <w:t xml:space="preserve"/>
+            </w:r>
+          </w:p>
+        </w:tc>
+      </w:tr>
+      <w:tr>
+        <w:tc>
+          <w:tcPr>
+            <w:tcW w:type="dxa" w:w="4990"/>
+            <w:tcBorders>
+              <w:top w:val="none" w:color="auto" w:sz="0"/>
+              <w:left w:val="none" w:color="auto" w:sz="0"/>
+              <w:bottom w:val="none" w:color="auto" w:sz="0"/>
+              <w:right w:val="none" w:color="auto" w:sz="0"/>
+            </w:tcBorders>
+            <w:tcMar>
+              <w:top w:type="dxa" w:w="20"/>
+              <w:left w:type="dxa" w:w="0"/>
+              <w:bottom w:type="dxa" w:w="20"/>
+              <w:right w:type="dxa" w:w="0"/>
+            </w:tcMar>
+          </w:tcPr>
+          <w:p>
+            <w:pPr>
+              <w:jc w:val="left"/>
+            </w:pPr>
+            <w:r>
+              <w:rPr>
+                <w:color w:val="404040"/>
+                <w:sz w:val="20"/>
+                <w:szCs w:val="20"/>
+              </w:rPr>
+              <w:t xml:space="preserve">Rédigé par : Martin Bitha, Centre des Solutions Informatiques</w:t>
             </w:r>
           </w:p>
         </w:tc>
@@ -826,9 +883,9 @@
       </w:tblPr>
       <w:tblGrid>
         <w:gridCol w:w="900"/>
-        <w:gridCol w:w="2822"/>
-        <w:gridCol w:w="3799"/>
-        <w:gridCol w:w="1551"/>
+        <w:gridCol w:w="2576"/>
+        <w:gridCol w:w="4175"/>
+        <w:gridCol w:w="1421"/>
       </w:tblGrid>
       <w:tr>
         <w:trPr>
@@ -859,7 +916,7 @@
         </w:tc>
         <w:tc>
           <w:tcPr>
-            <w:tcW w:type="dxa" w:w="2822"/>
+            <w:tcW w:type="dxa" w:w="2576"/>
             <w:shd w:fill="EDEDED" w:color="auto" w:val="clear"/>
             <w:tcMar>
               <w:top w:type="dxa" w:w="50"/>
@@ -882,7 +939,7 @@
         </w:tc>
         <w:tc>
           <w:tcPr>
-            <w:tcW w:type="dxa" w:w="3799"/>
+            <w:tcW w:type="dxa" w:w="4175"/>
             <w:shd w:fill="EDEDED" w:color="auto" w:val="clear"/>
             <w:tcMar>
               <w:top w:type="dxa" w:w="50"/>
@@ -905,7 +962,7 @@
         </w:tc>
         <w:tc>
           <w:tcPr>
-            <w:tcW w:type="dxa" w:w="1551"/>
+            <w:tcW w:type="dxa" w:w="1421"/>
             <w:shd w:fill="EDEDED" w:color="auto" w:val="clear"/>
             <w:tcMar>
               <w:top w:type="dxa" w:w="50"/>
@@ -950,7 +1007,7 @@
         </w:tc>
         <w:tc>
           <w:tcPr>
-            <w:tcW w:type="dxa" w:w="2822"/>
+            <w:tcW w:type="dxa" w:w="2576"/>
             <w:tcMar>
               <w:top w:type="dxa" w:w="50"/>
               <w:left w:type="dxa" w:w="90"/>
@@ -970,7 +1027,7 @@
         </w:tc>
         <w:tc>
           <w:tcPr>
-            <w:tcW w:type="dxa" w:w="3799"/>
+            <w:tcW w:type="dxa" w:w="4175"/>
             <w:tcMar>
               <w:top w:type="dxa" w:w="50"/>
               <w:left w:type="dxa" w:w="90"/>
@@ -990,7 +1047,7 @@
         </w:tc>
         <w:tc>
           <w:tcPr>
-            <w:tcW w:type="dxa" w:w="1551"/>
+            <w:tcW w:type="dxa" w:w="1421"/>
             <w:tcMar>
               <w:top w:type="dxa" w:w="50"/>
               <w:left w:type="dxa" w:w="90"/>
@@ -1032,7 +1089,7 @@
         </w:tc>
         <w:tc>
           <w:tcPr>
-            <w:tcW w:type="dxa" w:w="2822"/>
+            <w:tcW w:type="dxa" w:w="2576"/>
             <w:tcMar>
               <w:top w:type="dxa" w:w="50"/>
               <w:left w:type="dxa" w:w="90"/>
@@ -1052,7 +1109,7 @@
         </w:tc>
         <w:tc>
           <w:tcPr>
-            <w:tcW w:type="dxa" w:w="3799"/>
+            <w:tcW w:type="dxa" w:w="4175"/>
             <w:tcMar>
               <w:top w:type="dxa" w:w="50"/>
               <w:left w:type="dxa" w:w="90"/>
@@ -1072,7 +1129,7 @@
         </w:tc>
         <w:tc>
           <w:tcPr>
-            <w:tcW w:type="dxa" w:w="1551"/>
+            <w:tcW w:type="dxa" w:w="1421"/>
             <w:tcMar>
               <w:top w:type="dxa" w:w="50"/>
               <w:left w:type="dxa" w:w="90"/>
@@ -1114,7 +1171,7 @@
         </w:tc>
         <w:tc>
           <w:tcPr>
-            <w:tcW w:type="dxa" w:w="2822"/>
+            <w:tcW w:type="dxa" w:w="2576"/>
             <w:tcMar>
               <w:top w:type="dxa" w:w="50"/>
               <w:left w:type="dxa" w:w="90"/>
@@ -1134,7 +1191,7 @@
         </w:tc>
         <w:tc>
           <w:tcPr>
-            <w:tcW w:type="dxa" w:w="3799"/>
+            <w:tcW w:type="dxa" w:w="4175"/>
             <w:tcMar>
               <w:top w:type="dxa" w:w="50"/>
               <w:left w:type="dxa" w:w="90"/>
@@ -1154,7 +1211,7 @@
         </w:tc>
         <w:tc>
           <w:tcPr>
-            <w:tcW w:type="dxa" w:w="1551"/>
+            <w:tcW w:type="dxa" w:w="1421"/>
             <w:tcMar>
               <w:top w:type="dxa" w:w="50"/>
               <w:left w:type="dxa" w:w="90"/>
@@ -1196,7 +1253,7 @@
         </w:tc>
         <w:tc>
           <w:tcPr>
-            <w:tcW w:type="dxa" w:w="2822"/>
+            <w:tcW w:type="dxa" w:w="2576"/>
             <w:tcMar>
               <w:top w:type="dxa" w:w="50"/>
               <w:left w:type="dxa" w:w="90"/>
@@ -1216,7 +1273,7 @@
         </w:tc>
         <w:tc>
           <w:tcPr>
-            <w:tcW w:type="dxa" w:w="3799"/>
+            <w:tcW w:type="dxa" w:w="4175"/>
             <w:tcMar>
               <w:top w:type="dxa" w:w="50"/>
               <w:left w:type="dxa" w:w="90"/>
@@ -1236,7 +1293,7 @@
         </w:tc>
         <w:tc>
           <w:tcPr>
-            <w:tcW w:type="dxa" w:w="1551"/>
+            <w:tcW w:type="dxa" w:w="1421"/>
             <w:tcMar>
               <w:top w:type="dxa" w:w="50"/>
               <w:left w:type="dxa" w:w="90"/>
@@ -1278,7 +1335,7 @@
         </w:tc>
         <w:tc>
           <w:tcPr>
-            <w:tcW w:type="dxa" w:w="2822"/>
+            <w:tcW w:type="dxa" w:w="2576"/>
             <w:tcMar>
               <w:top w:type="dxa" w:w="50"/>
               <w:left w:type="dxa" w:w="90"/>
@@ -1298,7 +1355,7 @@
         </w:tc>
         <w:tc>
           <w:tcPr>
-            <w:tcW w:type="dxa" w:w="3799"/>
+            <w:tcW w:type="dxa" w:w="4175"/>
             <w:tcMar>
               <w:top w:type="dxa" w:w="50"/>
               <w:left w:type="dxa" w:w="90"/>
@@ -1318,7 +1375,7 @@
         </w:tc>
         <w:tc>
           <w:tcPr>
-            <w:tcW w:type="dxa" w:w="1551"/>
+            <w:tcW w:type="dxa" w:w="1421"/>
             <w:tcMar>
               <w:top w:type="dxa" w:w="50"/>
               <w:left w:type="dxa" w:w="90"/>
@@ -1360,7 +1417,7 @@
         </w:tc>
         <w:tc>
           <w:tcPr>
-            <w:tcW w:type="dxa" w:w="2822"/>
+            <w:tcW w:type="dxa" w:w="2576"/>
             <w:tcMar>
               <w:top w:type="dxa" w:w="50"/>
               <w:left w:type="dxa" w:w="90"/>
@@ -1380,7 +1437,7 @@
         </w:tc>
         <w:tc>
           <w:tcPr>
-            <w:tcW w:type="dxa" w:w="3799"/>
+            <w:tcW w:type="dxa" w:w="4175"/>
             <w:tcMar>
               <w:top w:type="dxa" w:w="50"/>
               <w:left w:type="dxa" w:w="90"/>
@@ -1400,7 +1457,7 @@
         </w:tc>
         <w:tc>
           <w:tcPr>
-            <w:tcW w:type="dxa" w:w="1551"/>
+            <w:tcW w:type="dxa" w:w="1421"/>
             <w:tcMar>
               <w:top w:type="dxa" w:w="50"/>
               <w:left w:type="dxa" w:w="90"/>
@@ -1442,7 +1499,7 @@
         </w:tc>
         <w:tc>
           <w:tcPr>
-            <w:tcW w:type="dxa" w:w="2822"/>
+            <w:tcW w:type="dxa" w:w="2576"/>
             <w:tcMar>
               <w:top w:type="dxa" w:w="50"/>
               <w:left w:type="dxa" w:w="90"/>
@@ -1462,7 +1519,7 @@
         </w:tc>
         <w:tc>
           <w:tcPr>
-            <w:tcW w:type="dxa" w:w="3799"/>
+            <w:tcW w:type="dxa" w:w="4175"/>
             <w:tcMar>
               <w:top w:type="dxa" w:w="50"/>
               <w:left w:type="dxa" w:w="90"/>
@@ -1482,7 +1539,7 @@
         </w:tc>
         <w:tc>
           <w:tcPr>
-            <w:tcW w:type="dxa" w:w="1551"/>
+            <w:tcW w:type="dxa" w:w="1421"/>
             <w:tcMar>
               <w:top w:type="dxa" w:w="50"/>
               <w:left w:type="dxa" w:w="90"/>
@@ -1497,6 +1554,88 @@
                 <w:szCs w:val="20"/>
               </w:rPr>
               <w:t xml:space="preserve">T4</w:t>
+            </w:r>
+          </w:p>
+        </w:tc>
+      </w:tr>
+      <w:tr>
+        <w:tc>
+          <w:tcPr>
+            <w:tcW w:type="dxa" w:w="900"/>
+            <w:tcMar>
+              <w:top w:type="dxa" w:w="50"/>
+              <w:left w:type="dxa" w:w="90"/>
+              <w:bottom w:type="dxa" w:w="50"/>
+              <w:right w:type="dxa" w:w="90"/>
+            </w:tcMar>
+          </w:tcPr>
+          <w:p>
+            <w:r>
+              <w:rPr>
+                <w:sz w:val="20"/>
+                <w:szCs w:val="20"/>
+              </w:rPr>
+              <w:t xml:space="preserve">8</w:t>
+            </w:r>
+          </w:p>
+        </w:tc>
+        <w:tc>
+          <w:tcPr>
+            <w:tcW w:type="dxa" w:w="2576"/>
+            <w:tcMar>
+              <w:top w:type="dxa" w:w="50"/>
+              <w:left w:type="dxa" w:w="90"/>
+              <w:bottom w:type="dxa" w:w="50"/>
+              <w:right w:type="dxa" w:w="90"/>
+            </w:tcMar>
+          </w:tcPr>
+          <w:p>
+            <w:r>
+              <w:rPr>
+                <w:sz w:val="20"/>
+                <w:szCs w:val="20"/>
+              </w:rPr>
+              <w:t xml:space="preserve">Escales et réseau</w:t>
+            </w:r>
+          </w:p>
+        </w:tc>
+        <w:tc>
+          <w:tcPr>
+            <w:tcW w:type="dxa" w:w="4175"/>
+            <w:tcMar>
+              <w:top w:type="dxa" w:w="50"/>
+              <w:left w:type="dxa" w:w="90"/>
+              <w:bottom w:type="dxa" w:w="50"/>
+              <w:right w:type="dxa" w:w="90"/>
+            </w:tcMar>
+          </w:tcPr>
+          <w:p>
+            <w:r>
+              <w:rPr>
+                <w:sz w:val="20"/>
+                <w:szCs w:val="20"/>
+              </w:rPr>
+              <w:t xml:space="preserve">A.7.1-7.12, A.8.20-8.23 (Starlink, postes des compagnies, matériel confié)</w:t>
+            </w:r>
+          </w:p>
+        </w:tc>
+        <w:tc>
+          <w:tcPr>
+            <w:tcW w:type="dxa" w:w="1421"/>
+            <w:tcMar>
+              <w:top w:type="dxa" w:w="50"/>
+              <w:left w:type="dxa" w:w="90"/>
+              <w:bottom w:type="dxa" w:w="50"/>
+              <w:right w:type="dxa" w:w="90"/>
+            </w:tcMar>
+          </w:tcPr>
+          <w:p>
+            <w:r>
+              <w:rPr>
+                <w:sz w:val="20"/>
+                <w:szCs w:val="20"/>
+              </w:rPr>
+              <w:t xml:space="preserve">T2</w:t>
             </w:r>
           </w:p>
         </w:tc>
@@ -1582,7 +1721,7 @@
               <w:jc w:val="center"/>
             </w:pPr>
             <w:r>
-              <w:t xml:space="preserve">Le Responsable de la Sécurité de l'Information</w:t>
+              <w:t xml:space="preserve">Le Responsable Informatique</w:t>
             </w:r>
           </w:p>
           <w:p>
@@ -1594,7 +1733,7 @@
                 <w:b/>
                 <w:bCs/>
               </w:rPr>
-              <w:t xml:space="preserve">Martin Bitha</w:t>
+              <w:t xml:space="preserve">Aristarque Kasonga</w:t>
             </w:r>
           </w:p>
         </w:tc>

</xml_diff>

<commit_message>
Documents ISO : bloc de signatures aligne (titre et nom colles, memes lignes des deux cotes)
Co-Authored-By: Claude Fable 5.1 <noreply@anthropic.com>
</commit_message>
<xml_diff>
--- a/apps/web/public/iso/AI-06-Audit-interne.docx
+++ b/apps/web/public/iso/AI-06-Audit-interne.docx
@@ -1717,7 +1717,16 @@
           </w:tcPr>
           <w:p>
             <w:pPr>
-              <w:spacing w:after="720"/>
+              <w:spacing w:after="40"/>
+              <w:jc w:val="center"/>
+            </w:pPr>
+            <w:r>
+              <w:t xml:space="preserve"/>
+            </w:r>
+          </w:p>
+          <w:p>
+            <w:pPr>
+              <w:spacing w:after="60"/>
               <w:jc w:val="center"/>
             </w:pPr>
             <w:r>
@@ -1764,7 +1773,7 @@
           </w:p>
           <w:p>
             <w:pPr>
-              <w:spacing w:after="720"/>
+              <w:spacing w:after="60"/>
               <w:jc w:val="center"/>
             </w:pPr>
             <w:r>

</xml_diff>